<commit_message>
Fill Choy interview logistics: 4 Aug 2026 telephone, ~30 min, same-day consent with WhatsApp transmittal chain
Voice call 12:02, blank form sent 16:07, signed scan returned 16:26 — consent contemporaneous with interview, no dual-dating needed. Still open: language, audio yes/no, identification-preference tick, countersignature.

Co-Authored-By: Claude Fable 5 <noreply@anthropic.com>
Claude-Session: https://claude.ai/code/session_01KoT3i8geZspYBMMKVYJUTG
</commit_message>
<xml_diff>
--- a/docs/thesis/expert_panel/Expert_Interview_Summary_Choy_DRAFT.docx
+++ b/docs/thesis/expert_panel/Expert_Interview_Summary_Choy_DRAFT.docx
@@ -89,7 +89,7 @@
           <w:b w:val="0"/>
           <w:i w:val="0"/>
         </w:rPr>
-        <w:t>Date of interview: [TO CONFIRM — consent is dated 4 Aug 2026; if the conversation took place earlier, record both dates under the dual-dating rule]. Mode: [in person / phone / video — TO CONFIRM]. Duration: [TO CONFIRM]. Language: [TO CONFIRM]. Primary record: researcher's notes [audio recording yes/no — TO CONFIRM; statement 6 permits audio].</w:t>
+        <w:t>Date of interview: 4 August 2026 (same day as consent — no dual-dating required). Mode: telephone. Duration: approximately 30 minutes. Language: [TO CONFIRM]. Primary record: researcher's notes [audio recording yes/no — TO CONFIRM; statement 6 permits audio]. Transmittal chain (author's WhatsApp screen capture, 4 Aug 2026): voice call 12:02; blank consent form (Consent_Form_DrChoy.docx) sent to Dr Choy 16:07 with a request to return by e-mail; Dr Choy acknowledged 16:09 and returned the signed scanned form (Sidney Tam Consent(1).pdf) via WhatsApp 16:26 the same afternoon.</w:t>
       </w:r>
     </w:p>
     <w:p>
@@ -194,7 +194,7 @@
           <w:b w:val="0"/>
           <w:i w:val="0"/>
         </w:rPr>
-        <w:t>Archived: signed consent form (4 Aug 2026); biodata (2022). To file: researcher's interview notes; identification-preference selection; researcher countersignature; interview date/mode/duration/language confirmation for the H.6 consultation register.</w:t>
+        <w:t>Archived: signed consent form (4 Aug 2026); biodata (2022); WhatsApp transmittal screen capture (received as in-chat image — to be re-sent as a file for the evidence folder). To file: researcher's interview notes; identification-preference selection; researcher countersignature; interview-language confirmation; audio yes/no.</w:t>
       </w:r>
     </w:p>
     <w:sectPr>

</xml_diff>

<commit_message>
Choy consent complete: named attribution authorised and countersigned via PDF annotation layer
The completed form carries the same scan plus two /Stamp annotations: a tick over the 'identify me by name' checkbox and the researcher's signature with date. Earlier 'identical file' finding corrected — the diff had covered only the embedded image and content stream, not the annotation layer; both stamps extracted and visually verified. Forensic rule extended to include /Annots.

Co-Authored-By: Claude Fable 5 <noreply@anthropic.com>
Claude-Session: https://claude.ai/code/session_01KoT3i8geZspYBMMKVYJUTG
</commit_message>
<xml_diff>
--- a/docs/thesis/expert_panel/Expert_Interview_Summary_Choy_DRAFT.docx
+++ b/docs/thesis/expert_panel/Expert_Interview_Summary_Choy_DRAFT.docx
@@ -72,7 +72,7 @@
           <w:b w:val="0"/>
           <w:i w:val="0"/>
         </w:rPr>
-        <w:t>A signed consent form was received on 4 August 2026: all nine consent statements initialled; participant signature dated 4 August 2026; project title, researcher and supervisor correctly stated. Outstanding on the form: (a) the identification preference shows NEITHER box selected — until Dr Choy ticks one, named attribution is NOT authorised and this summary must be treated as attributable only in anonymised form; (b) the researcher countersignature line is blank; (c) the footer carries the "Draft prepared for ethics review" banner, as on the other panel forms, to be regularised with the HSESC characterisation. The signed form and Dr Choy's 2022 biodata are archived in the thesis evidence folder.</w:t>
+        <w:t>A signed consent form was received on 4 August 2026: all nine consent statements initialled; participant signature dated 4 August 2026; project title, researcher and supervisor correctly stated. A completed version was received the same evening with two on-screen annotations, both verified in the PDF annotation layer: a tick selecting "I give permission to identify me by name and professional affiliation in agreed outputs" — named attribution IS authorised — and the researcher's countersignature with date (4 Aug 26) on the researcher line. Transmittal: Dr Choy ticked the box on his own device and returned the file; the researcher signed on-screen and archived it. The footer's "Draft prepared for ethics review" banner remains, as on the other panel forms, to be regularised with the HSESC characterisation. Both versions (first-received and completed) and Dr Choy's 2022 biodata are archived in the thesis evidence folder.</w:t>
       </w:r>
     </w:p>
     <w:p>
@@ -194,7 +194,7 @@
           <w:b w:val="0"/>
           <w:i w:val="0"/>
         </w:rPr>
-        <w:t>Archived: signed consent form (4 Aug 2026); biodata (2022); WhatsApp transmittal screen capture (received as in-chat image — to be re-sent as a file for the evidence folder). To file: researcher's interview notes; identification-preference selection; researcher countersignature; interview-language confirmation; audio yes/no.</w:t>
+        <w:t>Archived: signed consent form (first-received and completed/countersigned versions, 4 Aug 2026); biodata (2022); WhatsApp transmittal screen capture (received as in-chat image — to be re-sent as a file for the evidence folder). To file: the researcher's interview notes. The consent record itself is COMPLETE: all statements initialled, named attribution authorised, countersigned, interview and consent same-day.</w:t>
       </w:r>
     </w:p>
     <w:sectPr>

</xml_diff>